<commit_message>
B1 4H Cl 1-2 unificadas desde la edicion maestra (2H); hoja de arranque: tarea antes de las 7 pm
Co-Authored-By: Claude Fable 5.1 <noreply@anthropic.com>
</commit_message>
<xml_diff>
--- a/VERSION_2/B1_4H/HOJA_ARRANQUE_B1_2026-10-13.docx
+++ b/VERSION_2/B1_4H/HOJA_ARRANQUE_B1_2026-10-13.docx
@@ -441,7 +441,7 @@
                 <w:i/>
                 <w:sz w:val="20"/>
               </w:rPr>
-              <w:t>Dos: el video diario no es opcional. Todos los días, mínimo 3 minutos hablando de corrido, sin leer, al grupo de WhatsApp antes de la medianoche. Lo vemos antes de clase y cada uno recibe una corrección. Es su clase particular.</w:t>
+              <w:t>Dos: el video diario no es opcional. Todos los días, mínimo 3 minutos hablando de corrido, sin leer, al grupo de WhatsApp antes de las 7:00 p.m. del mismo día. Lo vemos antes de clase y cada uno recibe una corrección. Es su clase particular.</w:t>
             </w:r>
           </w:p>
           <w:p>
@@ -1106,7 +1106,7 @@
           <w:b w:val="0"/>
           <w:sz w:val="21"/>
         </w:rPr>
-        <w:t>, al grupo de WhatsApp del cohorte, antes de la medianoche. En todas las clases es video, no audio.</w:t>
+        <w:t>, al grupo de WhatsApp del cohorte, antes de las 7:00 p.m. del mismo día. En todas las clases es video, no audio.</w:t>
       </w:r>
     </w:p>
     <w:p>

</xml_diff>